<commit_message>
v1.26.1: Savings handout could be paid from any account, not just Savings
createSavingsHandout trusted a client-supplied account_id, checking only
that it belonged to some active account — a handout could be recorded
against the Primary account or any Secondary/operational account, debiting
money that was never actually the member's savings.

Now resolved server-side via getSavingsAccount(), the same helper every
other savings entry point (deposits, fixed-term withdrawals) already used.
A handout is always paid out of the one dedicated SAVINGS account, no
exceptions. Removed the "Pay From Account" picker from the Record Handout
modal to match; POST /savings/handouts no longer accepts account_id.

Code-only, no schema migration. CMS Bible updated (Section 4.11.3, Version
History), version bumped to 1.26.1 in both Render blueprints.
</commit_message>
<xml_diff>
--- a/docs/CMS_BIBLE.docx
+++ b/docs/CMS_BIBLE.docx
@@ -62,7 +62,7 @@
         <w:t xml:space="preserve"> </w:t>
       </w:r>
       <w:r>
-        <w:t xml:space="preserve">1.26.0</w:t>
+        <w:t xml:space="preserve">1.26.1</w:t>
       </w:r>
       <w:r>
         <w:t xml:space="preserve"> </w:t>
@@ -77,7 +77,7 @@
         <w:t xml:space="preserve"> </w:t>
       </w:r>
       <w:r>
-        <w:t xml:space="preserve">11 August 2026</w:t>
+        <w:t xml:space="preserve">12 August 2026</w:t>
       </w:r>
       <w:r>
         <w:t xml:space="preserve"> </w:t>
@@ -23367,6 +23367,153 @@
     </w:p>
     <w:p>
       <w:pPr>
+        <w:numPr>
+          <w:ilvl w:val="0"/>
+          <w:numId w:val="1031"/>
+        </w:numPr>
+        <w:pStyle w:val="Compact"/>
+      </w:pPr>
+      <w:r>
+        <w:rPr>
+          <w:b/>
+        </w:rPr>
+        <w:t xml:space="preserve">Fixed (v1.26.1) — a handout could be paid from any account, not just Savings.</w:t>
+      </w:r>
+      <w:r>
+        <w:t xml:space="preserve"> </w:t>
+      </w:r>
+      <w:r>
+        <w:rPr>
+          <w:rStyle w:val="VerbatimChar"/>
+        </w:rPr>
+        <w:t xml:space="preserve">createSavingsHandout</w:t>
+      </w:r>
+      <w:r>
+        <w:t xml:space="preserve"> </w:t>
+      </w:r>
+      <w:r>
+        <w:t xml:space="preserve">used to trust an</w:t>
+      </w:r>
+      <w:r>
+        <w:t xml:space="preserve"> </w:t>
+      </w:r>
+      <w:r>
+        <w:rPr>
+          <w:rStyle w:val="VerbatimChar"/>
+        </w:rPr>
+        <w:t xml:space="preserve">account_id</w:t>
+      </w:r>
+      <w:r>
+        <w:t xml:space="preserve"> </w:t>
+      </w:r>
+      <w:r>
+        <w:t xml:space="preserve">sent from the request body, checking only that it was</w:t>
+      </w:r>
+      <w:r>
+        <w:t xml:space="preserve"> </w:t>
+      </w:r>
+      <w:r>
+        <w:rPr>
+          <w:i/>
+        </w:rPr>
+        <w:t xml:space="preserve">some</w:t>
+      </w:r>
+      <w:r>
+        <w:t xml:space="preserve"> </w:t>
+      </w:r>
+      <w:r>
+        <w:t xml:space="preserve">active account — so a handout could be recorded against the Primary account or any Secondary/operational account, money that was never actually sitting in the member’s savings. It’s now resolved server-side via the same</w:t>
+      </w:r>
+      <w:r>
+        <w:t xml:space="preserve"> </w:t>
+      </w:r>
+      <w:r>
+        <w:rPr>
+          <w:rStyle w:val="VerbatimChar"/>
+        </w:rPr>
+        <w:t xml:space="preserve">getSavingsAccount(client)</w:t>
+      </w:r>
+      <w:r>
+        <w:t xml:space="preserve"> </w:t>
+      </w:r>
+      <w:r>
+        <w:t xml:space="preserve">helper every other savings entry point already used (deposits, fixed-term withdrawals) — a handout is always paid out of the one dedicated SAVINGS account, full stop, and the client can no longer choose otherwise. The</w:t>
+      </w:r>
+      <w:r>
+        <w:t xml:space="preserve"> </w:t>
+      </w:r>
+      <w:r>
+        <w:t xml:space="preserve">“</w:t>
+      </w:r>
+      <w:r>
+        <w:t xml:space="preserve">Pay From Account</w:t>
+      </w:r>
+      <w:r>
+        <w:t xml:space="preserve">”</w:t>
+      </w:r>
+      <w:r>
+        <w:t xml:space="preserve"> </w:t>
+      </w:r>
+      <w:r>
+        <w:t xml:space="preserve">dropdown was removed from</w:t>
+      </w:r>
+      <w:r>
+        <w:t xml:space="preserve"> </w:t>
+      </w:r>
+      <w:r>
+        <w:rPr>
+          <w:rStyle w:val="VerbatimChar"/>
+        </w:rPr>
+        <w:t xml:space="preserve">RecordHandoutModal</w:t>
+      </w:r>
+      <w:r>
+        <w:t xml:space="preserve"> </w:t>
+      </w:r>
+      <w:r>
+        <w:t xml:space="preserve">(</w:t>
+      </w:r>
+      <w:r>
+        <w:rPr>
+          <w:rStyle w:val="VerbatimChar"/>
+        </w:rPr>
+        <w:t xml:space="preserve">SavingsPage.jsx</w:t>
+      </w:r>
+      <w:r>
+        <w:t xml:space="preserve">) to match — there’s nothing to choose.</w:t>
+      </w:r>
+      <w:r>
+        <w:t xml:space="preserve"> </w:t>
+      </w:r>
+      <w:r>
+        <w:rPr>
+          <w:rStyle w:val="VerbatimChar"/>
+        </w:rPr>
+        <w:t xml:space="preserve">POST /savings/handouts</w:t>
+      </w:r>
+      <w:r>
+        <w:t xml:space="preserve"> </w:t>
+      </w:r>
+      <w:r>
+        <w:t xml:space="preserve">no longer accepts</w:t>
+      </w:r>
+      <w:r>
+        <w:t xml:space="preserve"> </w:t>
+      </w:r>
+      <w:r>
+        <w:rPr>
+          <w:rStyle w:val="VerbatimChar"/>
+        </w:rPr>
+        <w:t xml:space="preserve">account_id</w:t>
+      </w:r>
+      <w:r>
+        <w:t xml:space="preserve"> </w:t>
+      </w:r>
+      <w:r>
+        <w:t xml:space="preserve">at all.</w:t>
+      </w:r>
+    </w:p>
+    <w:p>
+      <w:pPr>
         <w:pStyle w:val="Heading5"/>
       </w:pPr>
       <w:bookmarkStart w:id="105" w:name="X475227f27c43daf0a52f4ad2042b01cb3255bbd"/>
@@ -23821,7 +23968,22 @@
               <w:jc w:val="left"/>
             </w:pPr>
             <w:r>
-              <w:t xml:space="preserve">Record a handout</w:t>
+              <w:t xml:space="preserve">Record a handout — always paid from the SAVINGS account, resolved server-side (v1.26.1); no</w:t>
+            </w:r>
+            <w:r>
+              <w:t xml:space="preserve"> </w:t>
+            </w:r>
+            <w:r>
+              <w:rPr>
+                <w:rStyle w:val="VerbatimChar"/>
+              </w:rPr>
+              <w:t xml:space="preserve">account_id</w:t>
+            </w:r>
+            <w:r>
+              <w:t xml:space="preserve"> </w:t>
+            </w:r>
+            <w:r>
+              <w:t xml:space="preserve">in the request</w:t>
             </w:r>
           </w:p>
         </w:tc>
@@ -24000,6 +24162,87 @@
       </w:r>
       <w:r>
         <w:t xml:space="preserve">null-crash fix (Critical Fix, per diagnostic report) should be spot-checked again after any future refactor of the handout flow, since it was a real production-crash bug once already.</w:t>
+      </w:r>
+    </w:p>
+    <w:p>
+      <w:pPr>
+        <w:numPr>
+          <w:ilvl w:val="0"/>
+          <w:numId w:val="1032"/>
+        </w:numPr>
+        <w:pStyle w:val="Compact"/>
+      </w:pPr>
+      <w:r>
+        <w:t xml:space="preserve">Sections 11.1/11.2 above describe an earlier, simpler design (a flat</w:t>
+      </w:r>
+      <w:r>
+        <w:t xml:space="preserve"> </w:t>
+      </w:r>
+      <w:r>
+        <w:rPr>
+          <w:rStyle w:val="VerbatimChar"/>
+        </w:rPr>
+        <w:t xml:space="preserve">savings_deposits</w:t>
+      </w:r>
+      <w:r>
+        <w:t xml:space="preserve"> </w:t>
+      </w:r>
+      <w:r>
+        <w:t xml:space="preserve">table, immediate handouts) that predates the current flexible/fixed-term split, the member-confirms-before-it-posts handout workflow (</w:t>
+      </w:r>
+      <w:r>
+        <w:rPr>
+          <w:rStyle w:val="VerbatimChar"/>
+        </w:rPr>
+        <w:t xml:space="preserve">PENDING_CONFIRMATION</w:t>
+      </w:r>
+      <w:r>
+        <w:t xml:space="preserve"> </w:t>
+      </w:r>
+      <w:r>
+        <w:t xml:space="preserve">→</w:t>
+      </w:r>
+      <w:r>
+        <w:t xml:space="preserve"> </w:t>
+      </w:r>
+      <w:r>
+        <w:rPr>
+          <w:rStyle w:val="VerbatimChar"/>
+        </w:rPr>
+        <w:t xml:space="preserve">confirmSavingsHandout</w:t>
+      </w:r>
+      <w:r>
+        <w:t xml:space="preserve">/</w:t>
+      </w:r>
+      <w:r>
+        <w:rPr>
+          <w:rStyle w:val="VerbatimChar"/>
+        </w:rPr>
+        <w:t xml:space="preserve">rejectSavingsHandout</w:t>
+      </w:r>
+      <w:r>
+        <w:t xml:space="preserve">),</w:t>
+      </w:r>
+      <w:r>
+        <w:t xml:space="preserve"> </w:t>
+      </w:r>
+      <w:r>
+        <w:rPr>
+          <w:rStyle w:val="VerbatimChar"/>
+        </w:rPr>
+        <w:t xml:space="preserve">savings_balances</w:t>
+      </w:r>
+      <w:r>
+        <w:t xml:space="preserve">/</w:t>
+      </w:r>
+      <w:r>
+        <w:rPr>
+          <w:rStyle w:val="VerbatimChar"/>
+        </w:rPr>
+        <w:t xml:space="preserve">member_savings</w:t>
+      </w:r>
+      <w:r>
+        <w:t xml:space="preserve">, and Savings Pool inflows — all implemented in code but not yet reflected here. Flagged for a fuller rewrite of this section, same treatment Section 4.10 (Side Fund) already got.</w:t>
       </w:r>
     </w:p>
     <w:p>
@@ -38214,7 +38457,7 @@
               <w:rPr>
                 <w:rStyle w:val="VerbatimChar"/>
               </w:rPr>
-              <w:t xml:space="preserve">1.26.0</w:t>
+              <w:t xml:space="preserve">1.26.1</w:t>
             </w:r>
           </w:p>
         </w:tc>
@@ -38236,7 +38479,7 @@
               <w:rPr>
                 <w:rStyle w:val="VerbatimChar"/>
               </w:rPr>
-              <w:t xml:space="preserve">1.26.0</w:t>
+              <w:t xml:space="preserve">1.26.1</w:t>
             </w:r>
             <w:r>
               <w:t xml:space="preserve"> </w:t>
@@ -60747,6 +60990,148 @@
             </w:r>
             <w:r>
               <w:t xml:space="preserve">.</w:t>
+            </w:r>
+          </w:p>
+        </w:tc>
+      </w:tr>
+      <w:tr>
+        <w:tc>
+          <w:tcPr>
+            <w:tcBorders>
+              <w:top w:val="single" w:sz="4" w:space="0" w:color="999999"/>
+              <w:left w:val="single" w:sz="4" w:space="0" w:color="999999"/>
+              <w:bottom w:val="single" w:sz="4" w:space="0" w:color="999999"/>
+              <w:right w:val="single" w:sz="4" w:space="0" w:color="999999"/>
+            </w:tcBorders>
+          </w:tcPr>
+          <w:p>
+            <w:pPr>
+              <w:pStyle w:val="Compact"/>
+              <w:jc w:val="left"/>
+            </w:pPr>
+            <w:r>
+              <w:t xml:space="preserve">1.26.1</w:t>
+            </w:r>
+          </w:p>
+        </w:tc>
+        <w:tc>
+          <w:tcPr>
+            <w:tcBorders>
+              <w:top w:val="single" w:sz="4" w:space="0" w:color="999999"/>
+              <w:left w:val="single" w:sz="4" w:space="0" w:color="999999"/>
+              <w:bottom w:val="single" w:sz="4" w:space="0" w:color="999999"/>
+              <w:right w:val="single" w:sz="4" w:space="0" w:color="999999"/>
+            </w:tcBorders>
+          </w:tcPr>
+          <w:p>
+            <w:pPr>
+              <w:pStyle w:val="Compact"/>
+              <w:jc w:val="left"/>
+            </w:pPr>
+            <w:r>
+              <w:rPr>
+                <w:b/>
+              </w:rPr>
+              <w:t xml:space="preserve">Fixed: a Savings handout could be paid from any account, not just Savings (Section 4.11.3).</w:t>
+            </w:r>
+            <w:r>
+              <w:t xml:space="preserve"> </w:t>
+            </w:r>
+            <w:r>
+              <w:rPr>
+                <w:rStyle w:val="VerbatimChar"/>
+              </w:rPr>
+              <w:t xml:space="preserve">createSavingsHandout</w:t>
+            </w:r>
+            <w:r>
+              <w:t xml:space="preserve"> </w:t>
+            </w:r>
+            <w:r>
+              <w:t xml:space="preserve">trusted a client-supplied</w:t>
+            </w:r>
+            <w:r>
+              <w:t xml:space="preserve"> </w:t>
+            </w:r>
+            <w:r>
+              <w:rPr>
+                <w:rStyle w:val="VerbatimChar"/>
+              </w:rPr>
+              <w:t xml:space="preserve">account_id</w:t>
+            </w:r>
+            <w:r>
+              <w:t xml:space="preserve">, checking only that it belonged to</w:t>
+            </w:r>
+            <w:r>
+              <w:t xml:space="preserve"> </w:t>
+            </w:r>
+            <w:r>
+              <w:rPr>
+                <w:i/>
+              </w:rPr>
+              <w:t xml:space="preserve">some</w:t>
+            </w:r>
+            <w:r>
+              <w:t xml:space="preserve"> </w:t>
+            </w:r>
+            <w:r>
+              <w:t xml:space="preserve">active account — a handout could be recorded against the Primary account or any Secondary/operational account, debiting money that was never actually the member’s savings. Now resolved server-side via</w:t>
+            </w:r>
+            <w:r>
+              <w:t xml:space="preserve"> </w:t>
+            </w:r>
+            <w:r>
+              <w:rPr>
+                <w:rStyle w:val="VerbatimChar"/>
+              </w:rPr>
+              <w:t xml:space="preserve">getSavingsAccount()</w:t>
+            </w:r>
+            <w:r>
+              <w:t xml:space="preserve">, the same helper every other savings entry point (deposits, fixed-term withdrawals) already used — always the one dedicated SAVINGS account, no exceptions. The</w:t>
+            </w:r>
+            <w:r>
+              <w:t xml:space="preserve"> </w:t>
+            </w:r>
+            <w:r>
+              <w:t xml:space="preserve">“</w:t>
+            </w:r>
+            <w:r>
+              <w:t xml:space="preserve">Pay From Account</w:t>
+            </w:r>
+            <w:r>
+              <w:t xml:space="preserve">”</w:t>
+            </w:r>
+            <w:r>
+              <w:t xml:space="preserve"> </w:t>
+            </w:r>
+            <w:r>
+              <w:t xml:space="preserve">picker was removed from the Record Handout modal to match;</w:t>
+            </w:r>
+            <w:r>
+              <w:t xml:space="preserve"> </w:t>
+            </w:r>
+            <w:r>
+              <w:rPr>
+                <w:rStyle w:val="VerbatimChar"/>
+              </w:rPr>
+              <w:t xml:space="preserve">POST /savings/handouts</w:t>
+            </w:r>
+            <w:r>
+              <w:t xml:space="preserve"> </w:t>
+            </w:r>
+            <w:r>
+              <w:t xml:space="preserve">no longer accepts</w:t>
+            </w:r>
+            <w:r>
+              <w:t xml:space="preserve"> </w:t>
+            </w:r>
+            <w:r>
+              <w:rPr>
+                <w:rStyle w:val="VerbatimChar"/>
+              </w:rPr>
+              <w:t xml:space="preserve">account_id</w:t>
+            </w:r>
+            <w:r>
+              <w:t xml:space="preserve">. Code-only, no schema migration.</w:t>
             </w:r>
           </w:p>
         </w:tc>

</xml_diff>